<commit_message>
Finalize Assignment 2 record against course memo
</commit_message>
<xml_diff>
--- a/agents/creation_agent/records/Assignment_2_Agent_Record_Shuoying_Wang.docx
+++ b/agents/creation_agent/records/Assignment_2_Agent_Record_Shuoying_Wang.docx
@@ -21,7 +21,7 @@
         <w:jc w:val="center"/>
       </w:pPr>
       <w:r>
-        <w:t>Specialist Agent Record</w:t>
+        <w:t>Creation Agent Record</w:t>
       </w:r>
     </w:p>
     <w:p>
@@ -365,7 +365,7 @@
               <w:rPr>
                 <w:sz w:val="17"/>
               </w:rPr>
-              <w:t>Branch</w:t>
+              <w:t>Final branch</w:t>
             </w:r>
           </w:p>
         </w:tc>
@@ -388,7 +388,7 @@
               <w:rPr>
                 <w:sz w:val="17"/>
               </w:rPr>
-              <w:t>assignment-2-creation-agent</w:t>
+              <w:t>main (development: assignment-2-creation-agent)</w:t>
             </w:r>
           </w:p>
         </w:tc>
@@ -490,7 +490,7 @@
               <w:rPr>
                 <w:sz w:val="17"/>
               </w:rPr>
-              <w:t>MASY1800_ET_Agent_Scaffold_v1_0; seven protected files intact.</w:t>
+              <w:t>MASY1800_ET_Agent_Scaffold_v1_0; seven protected files intact. Common JSON input/output contract and tools retained; specialist instructions and metadata under agents/creation_agent/.</w:t>
             </w:r>
           </w:p>
         </w:tc>
@@ -1441,7 +1441,7 @@
               <w:rPr>
                 <w:sz w:val="17"/>
               </w:rPr>
-              <w:t>S1 Vaswani 2017; S2 Brown 2020; S3 Ouyang 2022; S4 ReAct 2022/23; S5 Toolformer 2023; S6 OpenAI function calling 2023; S7 WebShop 2022. Full links/locators: evidence_verification.md.</w:t>
+              <w:t>S1 Vaswani 2017; S2 Brown 2020; S3 Ouyang 2022; S4 ReAct 2022/23; S5 Toolformer 2023; S6 OpenAI function calling 2023; S7 WebShop 2022. Full links: evidence_verification.md. Policy: check original sources, label causal inference, and abstain when evidence is insufficient.</w:t>
             </w:r>
           </w:p>
         </w:tc>
@@ -1979,7 +1979,7 @@
               <w:rPr>
                 <w:sz w:val="17"/>
               </w:rPr>
-              <w:t>ChatGPT supplied prior outputs. Codex compared files, checked original source pages, qualified claims and reran local checks. This drafted judgment requires student review; the separate Assignment 2 memo was unavailable.</w:t>
+              <w:t>ChatGPT supplied prior outputs. Codex compared saved files, checked original sources and the Assignment 2 memo, qualified claims, and reran local checks. Judgment is bounded to two saved contexts and remains open to student assessment.</w:t>
             </w:r>
           </w:p>
         </w:tc>

</xml_diff>